<commit_message>
feat: finish up thesis
</commit_message>
<xml_diff>
--- a/docs/thesis/dispozicija_jasa_zupancic.docx
+++ b/docs/thesis/dispozicija_jasa_zupancic.docx
@@ -277,7 +277,7 @@
           <w:sz w:val="32"/>
           <w:szCs w:val="32"/>
         </w:rPr>
-        <w:t>Realno-časovno zaznavanje drže na robnih napravah</w:t>
+        <w:t>Realnočasovno zaznavanje drže na robnih napravah</w:t>
       </w:r>
       <w:r>
         <w:rPr>
@@ -460,7 +460,6 @@
         <w:tc>
           <w:tcPr>
             <w:tcW w:w="3295" w:type="dxa"/>
-            <w:shd w:val="clear" w:color="auto" w:fill="auto"/>
           </w:tcPr>
           <w:p>
             <w:pPr>
@@ -480,7 +479,6 @@
         <w:tc>
           <w:tcPr>
             <w:tcW w:w="6560" w:type="dxa"/>
-            <w:shd w:val="clear" w:color="auto" w:fill="auto"/>
           </w:tcPr>
           <w:p>
             <w:pPr>
@@ -506,7 +504,6 @@
         <w:tc>
           <w:tcPr>
             <w:tcW w:w="3295" w:type="dxa"/>
-            <w:shd w:val="clear" w:color="auto" w:fill="auto"/>
           </w:tcPr>
           <w:p>
             <w:pPr>
@@ -526,7 +523,6 @@
         <w:tc>
           <w:tcPr>
             <w:tcW w:w="6560" w:type="dxa"/>
-            <w:shd w:val="clear" w:color="auto" w:fill="auto"/>
           </w:tcPr>
           <w:p>
             <w:pPr>
@@ -560,7 +556,6 @@
         <w:tc>
           <w:tcPr>
             <w:tcW w:w="3295" w:type="dxa"/>
-            <w:shd w:val="clear" w:color="auto" w:fill="auto"/>
           </w:tcPr>
           <w:p>
             <w:pPr>
@@ -574,7 +569,6 @@
         <w:tc>
           <w:tcPr>
             <w:tcW w:w="6560" w:type="dxa"/>
-            <w:shd w:val="clear" w:color="auto" w:fill="auto"/>
           </w:tcPr>
           <w:p>
             <w:pPr>
@@ -594,7 +588,6 @@
         <w:tc>
           <w:tcPr>
             <w:tcW w:w="3295" w:type="dxa"/>
-            <w:shd w:val="clear" w:color="auto" w:fill="auto"/>
           </w:tcPr>
           <w:p>
             <w:pPr>
@@ -632,7 +625,6 @@
         <w:tc>
           <w:tcPr>
             <w:tcW w:w="6560" w:type="dxa"/>
-            <w:shd w:val="clear" w:color="auto" w:fill="auto"/>
           </w:tcPr>
           <w:p>
             <w:pPr>
@@ -651,16 +643,8 @@
               <w:rPr>
                 <w:rFonts w:ascii="Calibri" w:hAnsi="Calibri"/>
               </w:rPr>
-              <w:t xml:space="preserve">ed. prof. dr. Aleš </w:t>
+              <w:t>ed. prof. dr. Aleš Holobar</w:t>
             </w:r>
-            <w:proofErr w:type="spellStart"/>
-            <w:r>
-              <w:rPr>
-                <w:rFonts w:ascii="Calibri" w:hAnsi="Calibri"/>
-              </w:rPr>
-              <w:t>Holobar</w:t>
-            </w:r>
-            <w:proofErr w:type="spellEnd"/>
             <w:r>
               <w:rPr>
                 <w:rFonts w:ascii="Calibri" w:hAnsi="Calibri"/>
@@ -678,7 +662,6 @@
         <w:tc>
           <w:tcPr>
             <w:tcW w:w="3295" w:type="dxa"/>
-            <w:shd w:val="clear" w:color="auto" w:fill="auto"/>
           </w:tcPr>
           <w:p>
             <w:pPr>
@@ -687,26 +670,17 @@
                 <w:rFonts w:ascii="Calibri" w:hAnsi="Calibri"/>
               </w:rPr>
             </w:pPr>
-            <w:proofErr w:type="spellStart"/>
             <w:r>
               <w:rPr>
                 <w:rFonts w:ascii="Calibri" w:hAnsi="Calibri"/>
               </w:rPr>
-              <w:t>Somentor</w:t>
-            </w:r>
-            <w:proofErr w:type="spellEnd"/>
-            <w:r>
-              <w:rPr>
-                <w:rFonts w:ascii="Calibri" w:hAnsi="Calibri"/>
-              </w:rPr>
-              <w:t>:</w:t>
+              <w:t>Somentor:</w:t>
             </w:r>
           </w:p>
         </w:tc>
         <w:tc>
           <w:tcPr>
             <w:tcW w:w="6560" w:type="dxa"/>
-            <w:shd w:val="clear" w:color="auto" w:fill="auto"/>
           </w:tcPr>
           <w:p>
             <w:pPr>
@@ -725,16 +699,8 @@
               <w:rPr>
                 <w:rFonts w:ascii="Calibri" w:hAnsi="Calibri"/>
               </w:rPr>
-              <w:t xml:space="preserve">r. Martin </w:t>
+              <w:t>r. Martin Šavc</w:t>
             </w:r>
-            <w:proofErr w:type="spellStart"/>
-            <w:r>
-              <w:rPr>
-                <w:rFonts w:ascii="Calibri" w:hAnsi="Calibri"/>
-              </w:rPr>
-              <w:t>Šavc</w:t>
-            </w:r>
-            <w:proofErr w:type="spellEnd"/>
           </w:p>
         </w:tc>
       </w:tr>
@@ -746,7 +712,6 @@
         <w:tc>
           <w:tcPr>
             <w:tcW w:w="3295" w:type="dxa"/>
-            <w:shd w:val="clear" w:color="auto" w:fill="auto"/>
           </w:tcPr>
           <w:p>
             <w:pPr>
@@ -759,28 +724,13 @@
               <w:rPr>
                 <w:rFonts w:ascii="Calibri" w:hAnsi="Calibri"/>
               </w:rPr>
-              <w:t xml:space="preserve">Zunanji delovni </w:t>
-            </w:r>
-            <w:proofErr w:type="spellStart"/>
-            <w:r>
-              <w:rPr>
-                <w:rFonts w:ascii="Calibri" w:hAnsi="Calibri"/>
-              </w:rPr>
-              <w:t>somentor</w:t>
-            </w:r>
-            <w:proofErr w:type="spellEnd"/>
-            <w:r>
-              <w:rPr>
-                <w:rFonts w:ascii="Calibri" w:hAnsi="Calibri"/>
-              </w:rPr>
-              <w:t>:</w:t>
+              <w:t>Zunanji delovni somentor:</w:t>
             </w:r>
           </w:p>
         </w:tc>
         <w:tc>
           <w:tcPr>
             <w:tcW w:w="6560" w:type="dxa"/>
-            <w:shd w:val="clear" w:color="auto" w:fill="auto"/>
           </w:tcPr>
           <w:p>
             <w:pPr>
@@ -793,21 +743,7 @@
               <w:rPr>
                 <w:rFonts w:ascii="Calibri" w:hAnsi="Calibri"/>
               </w:rPr>
-              <w:t xml:space="preserve">Andrej </w:t>
-            </w:r>
-            <w:proofErr w:type="spellStart"/>
-            <w:r>
-              <w:rPr>
-                <w:rFonts w:ascii="Calibri" w:hAnsi="Calibri"/>
-              </w:rPr>
-              <w:t>Miščič</w:t>
-            </w:r>
-            <w:proofErr w:type="spellEnd"/>
-            <w:r>
-              <w:rPr>
-                <w:rFonts w:ascii="Calibri" w:hAnsi="Calibri"/>
-              </w:rPr>
-              <w:t>, mag. inž. rač. in pod. ved.</w:t>
+              <w:t>Andrej Miščič, mag. inž. rač. in pod. ved.</w:t>
             </w:r>
           </w:p>
         </w:tc>
@@ -993,7 +929,7 @@
         <w:rPr>
           <w:rFonts w:ascii="Calibri" w:hAnsi="Calibri"/>
         </w:rPr>
-        <w:t>Realno-časovna ocena drže z uporabo velikih in arhitekturno zahtevnih modelov predstavlja izziv za uporabo na robnih napravah. Obstoječi modeli</w:t>
+        <w:t>Realnočasovna ocena drže z uporabo velikih in arhitekturno zahtevnih modelov predstavlja izziv za uporabo na robnih napravah. Obstoječi modeli</w:t>
       </w:r>
       <w:r>
         <w:rPr>
@@ -2089,103 +2025,11 @@
           <w:rFonts w:ascii="Calibri" w:hAnsi="Calibri"/>
         </w:rPr>
       </w:pPr>
-      <w:proofErr w:type="spellStart"/>
-      <w:r>
-        <w:rPr>
-          <w:rFonts w:ascii="Calibri" w:hAnsi="Calibri"/>
-        </w:rPr>
-        <w:t>MMPose</w:t>
-      </w:r>
-      <w:proofErr w:type="spellEnd"/>
-      <w:r>
-        <w:rPr>
-          <w:rFonts w:ascii="Calibri" w:hAnsi="Calibri"/>
-        </w:rPr>
-        <w:t xml:space="preserve"> </w:t>
-      </w:r>
-      <w:proofErr w:type="spellStart"/>
-      <w:r>
-        <w:rPr>
-          <w:rFonts w:ascii="Calibri" w:hAnsi="Calibri"/>
-        </w:rPr>
-        <w:t>Contributors</w:t>
-      </w:r>
-      <w:proofErr w:type="spellEnd"/>
-      <w:r>
-        <w:rPr>
-          <w:rFonts w:ascii="Calibri" w:hAnsi="Calibri"/>
-        </w:rPr>
-        <w:t xml:space="preserve">. </w:t>
-      </w:r>
-      <w:proofErr w:type="spellStart"/>
-      <w:r>
-        <w:rPr>
-          <w:rFonts w:ascii="Calibri" w:hAnsi="Calibri"/>
-        </w:rPr>
-        <w:t>OpenMMLab</w:t>
-      </w:r>
-      <w:proofErr w:type="spellEnd"/>
-      <w:r>
-        <w:rPr>
-          <w:rFonts w:ascii="Calibri" w:hAnsi="Calibri"/>
-        </w:rPr>
-        <w:t xml:space="preserve"> Pose </w:t>
-      </w:r>
-      <w:proofErr w:type="spellStart"/>
-      <w:r>
-        <w:rPr>
-          <w:rFonts w:ascii="Calibri" w:hAnsi="Calibri"/>
-        </w:rPr>
-        <w:t>Estimation</w:t>
-      </w:r>
-      <w:proofErr w:type="spellEnd"/>
-      <w:r>
-        <w:rPr>
-          <w:rFonts w:ascii="Calibri" w:hAnsi="Calibri"/>
-        </w:rPr>
-        <w:t xml:space="preserve"> </w:t>
-      </w:r>
-      <w:proofErr w:type="spellStart"/>
-      <w:r>
-        <w:rPr>
-          <w:rFonts w:ascii="Calibri" w:hAnsi="Calibri"/>
-        </w:rPr>
-        <w:t>Toolbox</w:t>
-      </w:r>
-      <w:proofErr w:type="spellEnd"/>
-      <w:r>
-        <w:rPr>
-          <w:rFonts w:ascii="Calibri" w:hAnsi="Calibri"/>
-        </w:rPr>
-        <w:t xml:space="preserve"> </w:t>
-      </w:r>
-      <w:proofErr w:type="spellStart"/>
-      <w:r>
-        <w:rPr>
-          <w:rFonts w:ascii="Calibri" w:hAnsi="Calibri"/>
-        </w:rPr>
-        <w:t>and</w:t>
-      </w:r>
-      <w:proofErr w:type="spellEnd"/>
-      <w:r>
-        <w:rPr>
-          <w:rFonts w:ascii="Calibri" w:hAnsi="Calibri"/>
-        </w:rPr>
-        <w:t xml:space="preserve"> </w:t>
-      </w:r>
-      <w:proofErr w:type="spellStart"/>
-      <w:r>
-        <w:rPr>
-          <w:rFonts w:ascii="Calibri" w:hAnsi="Calibri"/>
-        </w:rPr>
-        <w:t>Benchmark</w:t>
-      </w:r>
-      <w:proofErr w:type="spellEnd"/>
-      <w:r>
-        <w:rPr>
-          <w:rFonts w:ascii="Calibri" w:hAnsi="Calibri"/>
-        </w:rPr>
-        <w:t xml:space="preserve">. Dostopno na: </w:t>
+      <w:r>
+        <w:rPr>
+          <w:rFonts w:ascii="Calibri" w:hAnsi="Calibri"/>
+        </w:rPr>
+        <w:t xml:space="preserve">MMPose Contributors. OpenMMLab Pose Estimation Toolbox and Benchmark. Dostopno na: </w:t>
       </w:r>
       <w:hyperlink r:id="rId11" w:history="1">
         <w:r>
@@ -2222,173 +2066,11 @@
           <w:rFonts w:ascii="Calibri" w:hAnsi="Calibri"/>
         </w:rPr>
       </w:pPr>
-      <w:proofErr w:type="spellStart"/>
-      <w:r>
-        <w:rPr>
-          <w:rFonts w:ascii="Calibri" w:hAnsi="Calibri"/>
-        </w:rPr>
-        <w:t>Sun</w:t>
-      </w:r>
-      <w:proofErr w:type="spellEnd"/>
-      <w:r>
-        <w:rPr>
-          <w:rFonts w:ascii="Calibri" w:hAnsi="Calibri"/>
-        </w:rPr>
-        <w:t xml:space="preserve">, K., </w:t>
-      </w:r>
-      <w:proofErr w:type="spellStart"/>
-      <w:r>
-        <w:rPr>
-          <w:rFonts w:ascii="Calibri" w:hAnsi="Calibri"/>
-        </w:rPr>
-        <w:t>Xiao</w:t>
-      </w:r>
-      <w:proofErr w:type="spellEnd"/>
-      <w:r>
-        <w:rPr>
-          <w:rFonts w:ascii="Calibri" w:hAnsi="Calibri"/>
-        </w:rPr>
-        <w:t xml:space="preserve">, B., </w:t>
-      </w:r>
-      <w:proofErr w:type="spellStart"/>
-      <w:r>
-        <w:rPr>
-          <w:rFonts w:ascii="Calibri" w:hAnsi="Calibri"/>
-        </w:rPr>
-        <w:t>Liu</w:t>
-      </w:r>
-      <w:proofErr w:type="spellEnd"/>
-      <w:r>
-        <w:rPr>
-          <w:rFonts w:ascii="Calibri" w:hAnsi="Calibri"/>
-        </w:rPr>
-        <w:t xml:space="preserve">, D., </w:t>
-      </w:r>
-      <w:proofErr w:type="spellStart"/>
-      <w:r>
-        <w:rPr>
-          <w:rFonts w:ascii="Calibri" w:hAnsi="Calibri"/>
-        </w:rPr>
-        <w:t>Wang</w:t>
-      </w:r>
-      <w:proofErr w:type="spellEnd"/>
-      <w:r>
-        <w:rPr>
-          <w:rFonts w:ascii="Calibri" w:hAnsi="Calibri"/>
-        </w:rPr>
-        <w:t xml:space="preserve">, J. </w:t>
-      </w:r>
-      <w:proofErr w:type="spellStart"/>
-      <w:r>
-        <w:rPr>
-          <w:rFonts w:ascii="Calibri" w:hAnsi="Calibri"/>
-        </w:rPr>
-        <w:t>HigherHRNet</w:t>
-      </w:r>
-      <w:proofErr w:type="spellEnd"/>
-      <w:r>
-        <w:rPr>
-          <w:rFonts w:ascii="Calibri" w:hAnsi="Calibri"/>
-        </w:rPr>
-        <w:t>: Scale-</w:t>
-      </w:r>
-      <w:proofErr w:type="spellStart"/>
-      <w:r>
-        <w:rPr>
-          <w:rFonts w:ascii="Calibri" w:hAnsi="Calibri"/>
-        </w:rPr>
-        <w:t>Aware</w:t>
-      </w:r>
-      <w:proofErr w:type="spellEnd"/>
-      <w:r>
-        <w:rPr>
-          <w:rFonts w:ascii="Calibri" w:hAnsi="Calibri"/>
-        </w:rPr>
-        <w:t xml:space="preserve"> </w:t>
-      </w:r>
-      <w:proofErr w:type="spellStart"/>
-      <w:r>
-        <w:rPr>
-          <w:rFonts w:ascii="Calibri" w:hAnsi="Calibri"/>
-        </w:rPr>
-        <w:t>Representation</w:t>
-      </w:r>
-      <w:proofErr w:type="spellEnd"/>
-      <w:r>
-        <w:rPr>
-          <w:rFonts w:ascii="Calibri" w:hAnsi="Calibri"/>
-        </w:rPr>
-        <w:t xml:space="preserve"> </w:t>
-      </w:r>
-      <w:proofErr w:type="spellStart"/>
-      <w:r>
-        <w:rPr>
-          <w:rFonts w:ascii="Calibri" w:hAnsi="Calibri"/>
-        </w:rPr>
-        <w:t>Learning</w:t>
-      </w:r>
-      <w:proofErr w:type="spellEnd"/>
-      <w:r>
-        <w:rPr>
-          <w:rFonts w:ascii="Calibri" w:hAnsi="Calibri"/>
-        </w:rPr>
-        <w:t xml:space="preserve"> </w:t>
-      </w:r>
-      <w:proofErr w:type="spellStart"/>
-      <w:r>
-        <w:rPr>
-          <w:rFonts w:ascii="Calibri" w:hAnsi="Calibri"/>
-        </w:rPr>
-        <w:t>for</w:t>
-      </w:r>
-      <w:proofErr w:type="spellEnd"/>
-      <w:r>
-        <w:rPr>
-          <w:rFonts w:ascii="Calibri" w:hAnsi="Calibri"/>
-        </w:rPr>
-        <w:t xml:space="preserve"> </w:t>
-      </w:r>
-      <w:proofErr w:type="spellStart"/>
-      <w:r>
-        <w:rPr>
-          <w:rFonts w:ascii="Calibri" w:hAnsi="Calibri"/>
-        </w:rPr>
-        <w:t>Bottom</w:t>
-      </w:r>
-      <w:proofErr w:type="spellEnd"/>
-      <w:r>
-        <w:rPr>
-          <w:rFonts w:ascii="Calibri" w:hAnsi="Calibri"/>
-        </w:rPr>
-        <w:t xml:space="preserve">-Up Human Pose </w:t>
-      </w:r>
-      <w:proofErr w:type="spellStart"/>
-      <w:r>
-        <w:rPr>
-          <w:rFonts w:ascii="Calibri" w:hAnsi="Calibri"/>
-        </w:rPr>
-        <w:t>Estimation</w:t>
-      </w:r>
-      <w:proofErr w:type="spellEnd"/>
-      <w:r>
-        <w:rPr>
-          <w:rFonts w:ascii="Calibri" w:hAnsi="Calibri"/>
-        </w:rPr>
-        <w:t xml:space="preserve">. </w:t>
-      </w:r>
-      <w:proofErr w:type="spellStart"/>
-      <w:r>
-        <w:rPr>
-          <w:rFonts w:ascii="Calibri" w:hAnsi="Calibri"/>
-        </w:rPr>
-        <w:t>arXiv</w:t>
-      </w:r>
-      <w:proofErr w:type="spellEnd"/>
-      <w:r>
-        <w:rPr>
-          <w:rFonts w:ascii="Calibri" w:hAnsi="Calibri"/>
-        </w:rPr>
-        <w:t xml:space="preserve">, 2020, 2006.10204. Dostopno na: </w:t>
+      <w:r>
+        <w:rPr>
+          <w:rFonts w:ascii="Calibri" w:hAnsi="Calibri"/>
+        </w:rPr>
+        <w:t xml:space="preserve">Sun, K., Xiao, B., Liu, D., Wang, J. HigherHRNet: Scale-Aware Representation Learning for Bottom-Up Human Pose Estimation. arXiv, 2020, 2006.10204. Dostopno na: </w:t>
       </w:r>
       <w:hyperlink r:id="rId12" w:history="1">
         <w:r>
@@ -2425,103 +2107,11 @@
           <w:rFonts w:ascii="Calibri" w:hAnsi="Calibri"/>
         </w:rPr>
       </w:pPr>
-      <w:proofErr w:type="spellStart"/>
-      <w:r>
-        <w:rPr>
-          <w:rFonts w:ascii="Calibri" w:hAnsi="Calibri"/>
-        </w:rPr>
-        <w:t>Jiang</w:t>
-      </w:r>
-      <w:proofErr w:type="spellEnd"/>
-      <w:r>
-        <w:rPr>
-          <w:rFonts w:ascii="Calibri" w:hAnsi="Calibri"/>
-        </w:rPr>
-        <w:t xml:space="preserve">, T., </w:t>
-      </w:r>
-      <w:proofErr w:type="spellStart"/>
-      <w:r>
-        <w:rPr>
-          <w:rFonts w:ascii="Calibri" w:hAnsi="Calibri"/>
-        </w:rPr>
-        <w:t>Xie</w:t>
-      </w:r>
-      <w:proofErr w:type="spellEnd"/>
-      <w:r>
-        <w:rPr>
-          <w:rFonts w:ascii="Calibri" w:hAnsi="Calibri"/>
-        </w:rPr>
-        <w:t xml:space="preserve">, X., Li, Y. RTMW: Real-Time </w:t>
-      </w:r>
-      <w:proofErr w:type="spellStart"/>
-      <w:r>
-        <w:rPr>
-          <w:rFonts w:ascii="Calibri" w:hAnsi="Calibri"/>
-        </w:rPr>
-        <w:t>Multi</w:t>
-      </w:r>
-      <w:proofErr w:type="spellEnd"/>
-      <w:r>
-        <w:rPr>
-          <w:rFonts w:ascii="Calibri" w:hAnsi="Calibri"/>
-        </w:rPr>
-        <w:t xml:space="preserve">-Person 2D </w:t>
-      </w:r>
-      <w:proofErr w:type="spellStart"/>
-      <w:r>
-        <w:rPr>
-          <w:rFonts w:ascii="Calibri" w:hAnsi="Calibri"/>
-        </w:rPr>
-        <w:t>and</w:t>
-      </w:r>
-      <w:proofErr w:type="spellEnd"/>
-      <w:r>
-        <w:rPr>
-          <w:rFonts w:ascii="Calibri" w:hAnsi="Calibri"/>
-        </w:rPr>
-        <w:t xml:space="preserve"> 3D </w:t>
-      </w:r>
-      <w:proofErr w:type="spellStart"/>
-      <w:r>
-        <w:rPr>
-          <w:rFonts w:ascii="Calibri" w:hAnsi="Calibri"/>
-        </w:rPr>
-        <w:t>Whole-body</w:t>
-      </w:r>
-      <w:proofErr w:type="spellEnd"/>
-      <w:r>
-        <w:rPr>
-          <w:rFonts w:ascii="Calibri" w:hAnsi="Calibri"/>
-        </w:rPr>
-        <w:t xml:space="preserve"> Pose </w:t>
-      </w:r>
-      <w:proofErr w:type="spellStart"/>
-      <w:r>
-        <w:rPr>
-          <w:rFonts w:ascii="Calibri" w:hAnsi="Calibri"/>
-        </w:rPr>
-        <w:t>Estimation</w:t>
-      </w:r>
-      <w:proofErr w:type="spellEnd"/>
-      <w:r>
-        <w:rPr>
-          <w:rFonts w:ascii="Calibri" w:hAnsi="Calibri"/>
-        </w:rPr>
-        <w:t xml:space="preserve">. </w:t>
-      </w:r>
-      <w:proofErr w:type="spellStart"/>
-      <w:r>
-        <w:rPr>
-          <w:rFonts w:ascii="Calibri" w:hAnsi="Calibri"/>
-        </w:rPr>
-        <w:t>arXiv</w:t>
-      </w:r>
-      <w:proofErr w:type="spellEnd"/>
-      <w:r>
-        <w:rPr>
-          <w:rFonts w:ascii="Calibri" w:hAnsi="Calibri"/>
-        </w:rPr>
-        <w:t xml:space="preserve">, 2024, arXiv:2407.08634. Dostopno na: </w:t>
+      <w:r>
+        <w:rPr>
+          <w:rFonts w:ascii="Calibri" w:hAnsi="Calibri"/>
+        </w:rPr>
+        <w:t xml:space="preserve">Jiang, T., Xie, X., Li, Y. RTMW: Real-Time Multi-Person 2D and 3D Whole-body Pose Estimation. arXiv, 2024, arXiv:2407.08634. Dostopno na: </w:t>
       </w:r>
       <w:hyperlink r:id="rId13" w:history="1">
         <w:r>
@@ -2562,35 +2152,7 @@
         <w:rPr>
           <w:rFonts w:ascii="Calibri" w:hAnsi="Calibri"/>
         </w:rPr>
-        <w:t xml:space="preserve">Martinez, J., </w:t>
-      </w:r>
-      <w:proofErr w:type="spellStart"/>
-      <w:r>
-        <w:rPr>
-          <w:rFonts w:ascii="Calibri" w:hAnsi="Calibri"/>
-        </w:rPr>
-        <w:t>Hossain</w:t>
-      </w:r>
-      <w:proofErr w:type="spellEnd"/>
-      <w:r>
-        <w:rPr>
-          <w:rFonts w:ascii="Calibri" w:hAnsi="Calibri"/>
-        </w:rPr>
-        <w:t xml:space="preserve">, R., </w:t>
-      </w:r>
-      <w:proofErr w:type="spellStart"/>
-      <w:r>
-        <w:rPr>
-          <w:rFonts w:ascii="Calibri" w:hAnsi="Calibri"/>
-        </w:rPr>
-        <w:t>Romero</w:t>
-      </w:r>
-      <w:proofErr w:type="spellEnd"/>
-      <w:r>
-        <w:rPr>
-          <w:rFonts w:ascii="Calibri" w:hAnsi="Calibri"/>
-        </w:rPr>
-        <w:t xml:space="preserve">, J. 3d-pose-baseline. 2017. Dostopno na: </w:t>
+        <w:t xml:space="preserve">Martinez, J., Hossain, R., Romero, J. 3d-pose-baseline. 2017. Dostopno na: </w:t>
       </w:r>
       <w:hyperlink r:id="rId14" w:history="1">
         <w:r>
@@ -2631,21 +2193,7 @@
         <w:rPr>
           <w:rFonts w:ascii="Calibri" w:hAnsi="Calibri"/>
         </w:rPr>
-        <w:t xml:space="preserve">Fire717. </w:t>
-      </w:r>
-      <w:proofErr w:type="spellStart"/>
-      <w:r>
-        <w:rPr>
-          <w:rFonts w:ascii="Calibri" w:hAnsi="Calibri"/>
-        </w:rPr>
-        <w:t>movenet.pytorch</w:t>
-      </w:r>
-      <w:proofErr w:type="spellEnd"/>
-      <w:r>
-        <w:rPr>
-          <w:rFonts w:ascii="Calibri" w:hAnsi="Calibri"/>
-        </w:rPr>
-        <w:t xml:space="preserve">. 2021. Dostopno na: </w:t>
+        <w:t xml:space="preserve">Fire717. movenet.pytorch. 2021. Dostopno na: </w:t>
       </w:r>
       <w:hyperlink r:id="rId15" w:history="1">
         <w:r>
@@ -2680,77 +2228,7 @@
         <w:rPr>
           <w:rFonts w:ascii="Calibri" w:hAnsi="Calibri"/>
         </w:rPr>
-        <w:t xml:space="preserve">Votel, R., Li, N. </w:t>
-      </w:r>
-      <w:proofErr w:type="spellStart"/>
-      <w:r>
-        <w:rPr>
-          <w:rFonts w:ascii="Calibri" w:hAnsi="Calibri"/>
-        </w:rPr>
-        <w:t>Next-Generation</w:t>
-      </w:r>
-      <w:proofErr w:type="spellEnd"/>
-      <w:r>
-        <w:rPr>
-          <w:rFonts w:ascii="Calibri" w:hAnsi="Calibri"/>
-        </w:rPr>
-        <w:t xml:space="preserve"> Pose </w:t>
-      </w:r>
-      <w:proofErr w:type="spellStart"/>
-      <w:r>
-        <w:rPr>
-          <w:rFonts w:ascii="Calibri" w:hAnsi="Calibri"/>
-        </w:rPr>
-        <w:t>Detection</w:t>
-      </w:r>
-      <w:proofErr w:type="spellEnd"/>
-      <w:r>
-        <w:rPr>
-          <w:rFonts w:ascii="Calibri" w:hAnsi="Calibri"/>
-        </w:rPr>
-        <w:t xml:space="preserve"> </w:t>
-      </w:r>
-      <w:proofErr w:type="spellStart"/>
-      <w:r>
-        <w:rPr>
-          <w:rFonts w:ascii="Calibri" w:hAnsi="Calibri"/>
-        </w:rPr>
-        <w:t>with</w:t>
-      </w:r>
-      <w:proofErr w:type="spellEnd"/>
-      <w:r>
-        <w:rPr>
-          <w:rFonts w:ascii="Calibri" w:hAnsi="Calibri"/>
-        </w:rPr>
-        <w:t xml:space="preserve"> </w:t>
-      </w:r>
-      <w:proofErr w:type="spellStart"/>
-      <w:r>
-        <w:rPr>
-          <w:rFonts w:ascii="Calibri" w:hAnsi="Calibri"/>
-        </w:rPr>
-        <w:t>MoveNet</w:t>
-      </w:r>
-      <w:proofErr w:type="spellEnd"/>
-      <w:r>
-        <w:rPr>
-          <w:rFonts w:ascii="Calibri" w:hAnsi="Calibri"/>
-        </w:rPr>
-        <w:t xml:space="preserve"> </w:t>
-      </w:r>
-      <w:proofErr w:type="spellStart"/>
-      <w:r>
-        <w:rPr>
-          <w:rFonts w:ascii="Calibri" w:hAnsi="Calibri"/>
-        </w:rPr>
-        <w:t>and</w:t>
-      </w:r>
-      <w:proofErr w:type="spellEnd"/>
-      <w:r>
-        <w:rPr>
-          <w:rFonts w:ascii="Calibri" w:hAnsi="Calibri"/>
-        </w:rPr>
-        <w:t xml:space="preserve"> TensorFlow.js. 17. 5. 2021. Dostopno na: </w:t>
+        <w:t xml:space="preserve">Votel, R., Li, N. Next-Generation Pose Detection with MoveNet and TensorFlow.js. 17. 5. 2021. Dostopno na: </w:t>
       </w:r>
       <w:hyperlink r:id="rId16" w:history="1">
         <w:r>

</xml_diff>